<commit_message>
Remove the last time-bound wording from Chapters 22 and 27
Co-Authored-By: Claude Opus 5.5 <noreply@anthropic.com>
Claude-Session: https://claude.ai/code/session_01VkNWz9zCVkDAANuF8jpQYy
</commit_message>
<xml_diff>
--- a/Translation-Handbook-Light.docx
+++ b/Translation-Handbook-Light.docx
@@ -29453,7 +29453,7 @@
         <w:rPr>
           <w:rFonts w:ascii="Calibri" w:cs="Calibri" w:eastAsia="Calibri" w:hAnsi="Calibri"/>
         </w:rPr>
-        <w:t xml:space="preserve">: early systems used rules, then statistics; today most use neural networks. Neural systems are much more fluent, but they can still be wrong.</w:t>
+        <w:t xml:space="preserve">: early systems used rules, later ones statistics, and newer ones neural networks and AI. Each generation sounds more fluent, but every one can still be wrong.</w:t>
       </w:r>
     </w:p>
     <w:p>
@@ -29852,7 +29852,7 @@
         <w:rPr>
           <w:rFonts w:ascii="Calibri" w:cs="Calibri" w:eastAsia="Calibri" w:hAnsi="Calibri"/>
         </w:rPr>
-        <w:t xml:space="preserve">. The course materials call it the new direction for translators worldwide (Translation Team, n.d.). </w:t>
+        <w:t xml:space="preserve">. It has become a regular part of translators’ work (Translation Team, n.d.). </w:t>
       </w:r>
       <w:r>
         <w:rPr>
@@ -35489,7 +35489,7 @@
         <w:rPr>
           <w:rFonts w:ascii="Calibri" w:cs="Calibri" w:eastAsia="Calibri" w:hAnsi="Calibri"/>
         </w:rPr>
-        <w:t xml:space="preserve">Viewers read while they watch, so a subtitle normally has one or two lines. Each line traditionally holds about 37 to 39 characters; streaming platforms now allow up to 42. It must stay on screen long enough to be read, usually from about one to six or seven seconds. It must also appear and disappear with the speech: marking these in and out times is called </w:t>
+        <w:t xml:space="preserve">Viewers read while they watch, so a subtitle normally has one or two lines. Each line traditionally holds about 37 to 39 characters; some streaming platforms allow up to 42. It must stay on screen long enough to be read, usually from about one to six or seven seconds. It must also appear and disappear with the speech: marking these in and out times is called </w:t>
       </w:r>
       <w:r>
         <w:rPr>

</xml_diff>